<commit_message>
Update datasets, notebooks, docs, and add model artifacts
- Expand datasets_filtered/ CSVs with additional rows across all tables
- Update executed notebooks 01, 02, and 03 with latest outputs
- Add artifacts: extraction accuracy, model AUCs, feature importances,
  and submission files for LR and RF models
- Update SyntheticDataForBNPL.docx

Made-with: Cursor
</commit_message>
<xml_diff>
--- a/docs/SyntheticDataForBNPL.docx
+++ b/docs/SyntheticDataForBNPL.docx
@@ -3463,6 +3463,2356 @@
         </w:rPr>
       </w:r>
     </w:p>
+    <w:tbl>
+      <w:tblPr>
+        <w:tblW w:type="auto" w:w="0"/>
+        <w:tblLook w:firstColumn="1" w:firstRow="1" w:lastColumn="0" w:lastRow="0" w:noHBand="0" w:noVBand="1" w:val="04A0"/>
+      </w:tblPr>
+      <w:tblGrid>
+        <w:gridCol w:w="1872"/>
+        <w:gridCol w:w="1872"/>
+        <w:gridCol w:w="1872"/>
+        <w:gridCol w:w="1872"/>
+        <w:gridCol w:w="1872"/>
+      </w:tblGrid>
+      <w:tr>
+        <w:tc>
+          <w:tcPr>
+            <w:tcW w:type="dxa" w:w="1872"/>
+          </w:tcPr>
+          <w:p>
+            <w:r>
+              <w:t>Model</w:t>
+            </w:r>
+          </w:p>
+        </w:tc>
+        <w:tc>
+          <w:tcPr>
+            <w:tcW w:type="dxa" w:w="1872"/>
+          </w:tcPr>
+          <w:p>
+            <w:r>
+              <w:t>ROC-AUC</w:t>
+            </w:r>
+          </w:p>
+        </w:tc>
+        <w:tc>
+          <w:tcPr>
+            <w:tcW w:type="dxa" w:w="1872"/>
+          </w:tcPr>
+          <w:p>
+            <w:r>
+              <w:t>KS Statistic</w:t>
+            </w:r>
+          </w:p>
+        </w:tc>
+        <w:tc>
+          <w:tcPr>
+            <w:tcW w:type="dxa" w:w="1872"/>
+          </w:tcPr>
+          <w:p>
+            <w:r>
+              <w:t>Gini</w:t>
+            </w:r>
+          </w:p>
+        </w:tc>
+        <w:tc>
+          <w:tcPr>
+            <w:tcW w:type="dxa" w:w="1872"/>
+          </w:tcPr>
+          <w:p>
+            <w:r>
+              <w:t>AUC Delta vs A</w:t>
+            </w:r>
+          </w:p>
+        </w:tc>
+      </w:tr>
+      <w:tr>
+        <w:tc>
+          <w:tcPr>
+            <w:tcW w:type="dxa" w:w="1872"/>
+          </w:tcPr>
+          <w:p>
+            <w:r>
+              <w:t>Model A (Full Structured)</w:t>
+            </w:r>
+          </w:p>
+        </w:tc>
+        <w:tc>
+          <w:tcPr>
+            <w:tcW w:type="dxa" w:w="1872"/>
+          </w:tcPr>
+          <w:p>
+            <w:r>
+              <w:t>0.823718</w:t>
+            </w:r>
+          </w:p>
+        </w:tc>
+        <w:tc>
+          <w:tcPr>
+            <w:tcW w:type="dxa" w:w="1872"/>
+          </w:tcPr>
+          <w:p>
+            <w:r>
+              <w:t>0.538462</w:t>
+            </w:r>
+          </w:p>
+        </w:tc>
+        <w:tc>
+          <w:tcPr>
+            <w:tcW w:type="dxa" w:w="1872"/>
+          </w:tcPr>
+          <w:p>
+            <w:r>
+              <w:t>0.647436</w:t>
+            </w:r>
+          </w:p>
+        </w:tc>
+        <w:tc>
+          <w:tcPr>
+            <w:tcW w:type="dxa" w:w="1872"/>
+          </w:tcPr>
+          <w:p>
+            <w:r>
+              <w:t>+0.000000</w:t>
+            </w:r>
+          </w:p>
+        </w:tc>
+      </w:tr>
+      <w:tr>
+        <w:tc>
+          <w:tcPr>
+            <w:tcW w:type="dxa" w:w="1872"/>
+          </w:tcPr>
+          <w:p>
+            <w:r>
+              <w:t>Model B (Trimmed Only)</w:t>
+            </w:r>
+          </w:p>
+        </w:tc>
+        <w:tc>
+          <w:tcPr>
+            <w:tcW w:type="dxa" w:w="1872"/>
+          </w:tcPr>
+          <w:p>
+            <w:r>
+              <w:t>0.766026</w:t>
+            </w:r>
+          </w:p>
+        </w:tc>
+        <w:tc>
+          <w:tcPr>
+            <w:tcW w:type="dxa" w:w="1872"/>
+          </w:tcPr>
+          <w:p>
+            <w:r>
+              <w:t>0.474359</w:t>
+            </w:r>
+          </w:p>
+        </w:tc>
+        <w:tc>
+          <w:tcPr>
+            <w:tcW w:type="dxa" w:w="1872"/>
+          </w:tcPr>
+          <w:p>
+            <w:r>
+              <w:t>0.532051</w:t>
+            </w:r>
+          </w:p>
+        </w:tc>
+        <w:tc>
+          <w:tcPr>
+            <w:tcW w:type="dxa" w:w="1872"/>
+          </w:tcPr>
+          <w:p>
+            <w:r>
+              <w:t>-0.057692</w:t>
+            </w:r>
+          </w:p>
+        </w:tc>
+      </w:tr>
+      <w:tr>
+        <w:tc>
+          <w:tcPr>
+            <w:tcW w:type="dxa" w:w="1872"/>
+          </w:tcPr>
+          <w:p>
+            <w:r>
+              <w:t>Model C (Trimmed + Extracted)</w:t>
+            </w:r>
+          </w:p>
+        </w:tc>
+        <w:tc>
+          <w:tcPr>
+            <w:tcW w:type="dxa" w:w="1872"/>
+          </w:tcPr>
+          <w:p>
+            <w:r>
+              <w:t>0.766026</w:t>
+            </w:r>
+          </w:p>
+        </w:tc>
+        <w:tc>
+          <w:tcPr>
+            <w:tcW w:type="dxa" w:w="1872"/>
+          </w:tcPr>
+          <w:p>
+            <w:r>
+              <w:t>0.474359</w:t>
+            </w:r>
+          </w:p>
+        </w:tc>
+        <w:tc>
+          <w:tcPr>
+            <w:tcW w:type="dxa" w:w="1872"/>
+          </w:tcPr>
+          <w:p>
+            <w:r>
+              <w:t>0.532051</w:t>
+            </w:r>
+          </w:p>
+        </w:tc>
+        <w:tc>
+          <w:tcPr>
+            <w:tcW w:type="dxa" w:w="1872"/>
+          </w:tcPr>
+          <w:p>
+            <w:r>
+              <w:t>-0.057692</w:t>
+            </w:r>
+          </w:p>
+        </w:tc>
+      </w:tr>
+    </w:tbl>
+    <w:tbl>
+      <w:tblPr>
+        <w:tblW w:type="auto" w:w="0"/>
+        <w:tblLook w:firstColumn="1" w:firstRow="1" w:lastColumn="0" w:lastRow="0" w:noHBand="0" w:noVBand="1" w:val="04A0"/>
+      </w:tblPr>
+      <w:tblGrid>
+        <w:gridCol w:w="3120"/>
+        <w:gridCol w:w="3120"/>
+        <w:gridCol w:w="3120"/>
+      </w:tblGrid>
+      <w:tr>
+        <w:tc>
+          <w:tcPr>
+            <w:tcW w:type="dxa" w:w="3120"/>
+          </w:tcPr>
+          <w:p>
+            <w:r>
+              <w:t>Criterion</w:t>
+            </w:r>
+          </w:p>
+        </w:tc>
+        <w:tc>
+          <w:tcPr>
+            <w:tcW w:type="dxa" w:w="3120"/>
+          </w:tcPr>
+          <w:p>
+            <w:r>
+              <w:t>Result</w:t>
+            </w:r>
+          </w:p>
+        </w:tc>
+        <w:tc>
+          <w:tcPr>
+            <w:tcW w:type="dxa" w:w="3120"/>
+          </w:tcPr>
+          <w:p>
+            <w:r>
+              <w:t>Status</w:t>
+            </w:r>
+          </w:p>
+        </w:tc>
+      </w:tr>
+      <w:tr>
+        <w:tc>
+          <w:tcPr>
+            <w:tcW w:type="dxa" w:w="3120"/>
+          </w:tcPr>
+          <w:p>
+            <w:r>
+              <w:t>Document generation success rate &gt;= 95%</w:t>
+            </w:r>
+          </w:p>
+        </w:tc>
+        <w:tc>
+          <w:tcPr>
+            <w:tcW w:type="dxa" w:w="3120"/>
+          </w:tcPr>
+          <w:p>
+            <w:r>
+              <w:t>715/716 (99.9%)</w:t>
+            </w:r>
+          </w:p>
+        </w:tc>
+        <w:tc>
+          <w:tcPr>
+            <w:tcW w:type="dxa" w:w="3120"/>
+          </w:tcPr>
+          <w:p>
+            <w:r>
+              <w:t>REVIEW</w:t>
+            </w:r>
+          </w:p>
+        </w:tc>
+      </w:tr>
+      <w:tr>
+        <w:tc>
+          <w:tcPr>
+            <w:tcW w:type="dxa" w:w="3120"/>
+          </w:tcPr>
+          <w:p>
+            <w:r>
+              <w:t>LLM extraction valid JSON parse rate &gt;= 90%</w:t>
+            </w:r>
+          </w:p>
+        </w:tc>
+        <w:tc>
+          <w:tcPr>
+            <w:tcW w:type="dxa" w:w="3120"/>
+          </w:tcPr>
+          <w:p>
+            <w:r>
+              <w:t>59/60 (98.3%)</w:t>
+            </w:r>
+          </w:p>
+        </w:tc>
+        <w:tc>
+          <w:tcPr>
+            <w:tcW w:type="dxa" w:w="3120"/>
+          </w:tcPr>
+          <w:p>
+            <w:r>
+              <w:t>REVIEW</w:t>
+            </w:r>
+          </w:p>
+        </w:tc>
+      </w:tr>
+      <w:tr>
+        <w:tc>
+          <w:tcPr>
+            <w:tcW w:type="dxa" w:w="3120"/>
+          </w:tcPr>
+          <w:p>
+            <w:r>
+              <w:t>Extraction accuracy — categorical &gt;= 85%</w:t>
+            </w:r>
+          </w:p>
+        </w:tc>
+        <w:tc>
+          <w:tcPr>
+            <w:tcW w:type="dxa" w:w="3120"/>
+          </w:tcPr>
+          <w:p>
+            <w:r>
+              <w:t>37/39 (94.9%)</w:t>
+            </w:r>
+          </w:p>
+        </w:tc>
+        <w:tc>
+          <w:tcPr>
+            <w:tcW w:type="dxa" w:w="3120"/>
+          </w:tcPr>
+          <w:p>
+            <w:r>
+              <w:t>REVIEW</w:t>
+            </w:r>
+          </w:p>
+        </w:tc>
+      </w:tr>
+      <w:tr>
+        <w:tc>
+          <w:tcPr>
+            <w:tcW w:type="dxa" w:w="3120"/>
+          </w:tcPr>
+          <w:p>
+            <w:r>
+              <w:t>Extraction accuracy — numeric &gt;= 80% (±10%)</w:t>
+            </w:r>
+          </w:p>
+        </w:tc>
+        <w:tc>
+          <w:tcPr>
+            <w:tcW w:type="dxa" w:w="3120"/>
+          </w:tcPr>
+          <w:p>
+            <w:r>
+              <w:t>3/28 (10.7%)</w:t>
+            </w:r>
+          </w:p>
+        </w:tc>
+        <w:tc>
+          <w:tcPr>
+            <w:tcW w:type="dxa" w:w="3120"/>
+          </w:tcPr>
+          <w:p>
+            <w:r>
+              <w:t>REVIEW</w:t>
+            </w:r>
+          </w:p>
+        </w:tc>
+      </w:tr>
+      <w:tr>
+        <w:tc>
+          <w:tcPr>
+            <w:tcW w:type="dxa" w:w="3120"/>
+          </w:tcPr>
+          <w:p>
+            <w:r>
+              <w:t>ROC-AUC delta (A vs C) &lt; 0.02</w:t>
+            </w:r>
+          </w:p>
+        </w:tc>
+        <w:tc>
+          <w:tcPr>
+            <w:tcW w:type="dxa" w:w="3120"/>
+          </w:tcPr>
+          <w:p>
+            <w:r>
+              <w:t>0.057692 (FAIL)</w:t>
+            </w:r>
+          </w:p>
+        </w:tc>
+        <w:tc>
+          <w:tcPr>
+            <w:tcW w:type="dxa" w:w="3120"/>
+          </w:tcPr>
+          <w:p>
+            <w:r>
+              <w:t>REVIEW</w:t>
+            </w:r>
+          </w:p>
+        </w:tc>
+      </w:tr>
+      <w:tr>
+        <w:tc>
+          <w:tcPr>
+            <w:tcW w:type="dxa" w:w="3120"/>
+          </w:tcPr>
+          <w:p>
+            <w:r>
+              <w:t>Model B ROC-AUC &gt; 0.70</w:t>
+            </w:r>
+          </w:p>
+        </w:tc>
+        <w:tc>
+          <w:tcPr>
+            <w:tcW w:type="dxa" w:w="3120"/>
+          </w:tcPr>
+          <w:p>
+            <w:r>
+              <w:t>0.766026 (PASS)</w:t>
+            </w:r>
+          </w:p>
+        </w:tc>
+        <w:tc>
+          <w:tcPr>
+            <w:tcW w:type="dxa" w:w="3120"/>
+          </w:tcPr>
+          <w:p>
+            <w:r>
+              <w:t>PASS</w:t>
+            </w:r>
+          </w:p>
+        </w:tc>
+      </w:tr>
+    </w:tbl>
+    <w:tbl>
+      <w:tblPr>
+        <w:tblW w:type="auto" w:w="0"/>
+        <w:tblLook w:firstColumn="1" w:firstRow="1" w:lastColumn="0" w:lastRow="0" w:noHBand="0" w:noVBand="1" w:val="04A0"/>
+      </w:tblPr>
+      <w:tblGrid>
+        <w:gridCol w:w="1872"/>
+        <w:gridCol w:w="1872"/>
+        <w:gridCol w:w="1872"/>
+        <w:gridCol w:w="1872"/>
+        <w:gridCol w:w="1872"/>
+      </w:tblGrid>
+      <w:tr>
+        <w:tc>
+          <w:tcPr>
+            <w:tcW w:type="dxa" w:w="1872"/>
+          </w:tcPr>
+          <w:p>
+            <w:r>
+              <w:t>Model</w:t>
+            </w:r>
+          </w:p>
+        </w:tc>
+        <w:tc>
+          <w:tcPr>
+            <w:tcW w:type="dxa" w:w="1872"/>
+          </w:tcPr>
+          <w:p>
+            <w:r>
+              <w:t>ROC-AUC</w:t>
+            </w:r>
+          </w:p>
+        </w:tc>
+        <w:tc>
+          <w:tcPr>
+            <w:tcW w:type="dxa" w:w="1872"/>
+          </w:tcPr>
+          <w:p>
+            <w:r>
+              <w:t>KS Statistic</w:t>
+            </w:r>
+          </w:p>
+        </w:tc>
+        <w:tc>
+          <w:tcPr>
+            <w:tcW w:type="dxa" w:w="1872"/>
+          </w:tcPr>
+          <w:p>
+            <w:r>
+              <w:t>Gini</w:t>
+            </w:r>
+          </w:p>
+        </w:tc>
+        <w:tc>
+          <w:tcPr>
+            <w:tcW w:type="dxa" w:w="1872"/>
+          </w:tcPr>
+          <w:p>
+            <w:r>
+              <w:t>AUC Delta vs A</w:t>
+            </w:r>
+          </w:p>
+        </w:tc>
+      </w:tr>
+      <w:tr>
+        <w:tc>
+          <w:tcPr>
+            <w:tcW w:type="dxa" w:w="1872"/>
+          </w:tcPr>
+          <w:p>
+            <w:r>
+              <w:t>Model A (Full Structured)</w:t>
+            </w:r>
+          </w:p>
+        </w:tc>
+        <w:tc>
+          <w:tcPr>
+            <w:tcW w:type="dxa" w:w="1872"/>
+          </w:tcPr>
+          <w:p>
+            <w:r>
+              <w:t>0.823718</w:t>
+            </w:r>
+          </w:p>
+        </w:tc>
+        <w:tc>
+          <w:tcPr>
+            <w:tcW w:type="dxa" w:w="1872"/>
+          </w:tcPr>
+          <w:p>
+            <w:r>
+              <w:t>0.538462</w:t>
+            </w:r>
+          </w:p>
+        </w:tc>
+        <w:tc>
+          <w:tcPr>
+            <w:tcW w:type="dxa" w:w="1872"/>
+          </w:tcPr>
+          <w:p>
+            <w:r>
+              <w:t>0.647436</w:t>
+            </w:r>
+          </w:p>
+        </w:tc>
+        <w:tc>
+          <w:tcPr>
+            <w:tcW w:type="dxa" w:w="1872"/>
+          </w:tcPr>
+          <w:p>
+            <w:r>
+              <w:t>+0.000000</w:t>
+            </w:r>
+          </w:p>
+        </w:tc>
+      </w:tr>
+      <w:tr>
+        <w:tc>
+          <w:tcPr>
+            <w:tcW w:type="dxa" w:w="1872"/>
+          </w:tcPr>
+          <w:p>
+            <w:r>
+              <w:t>Model B (Trimmed Only)</w:t>
+            </w:r>
+          </w:p>
+        </w:tc>
+        <w:tc>
+          <w:tcPr>
+            <w:tcW w:type="dxa" w:w="1872"/>
+          </w:tcPr>
+          <w:p>
+            <w:r>
+              <w:t>0.766026</w:t>
+            </w:r>
+          </w:p>
+        </w:tc>
+        <w:tc>
+          <w:tcPr>
+            <w:tcW w:type="dxa" w:w="1872"/>
+          </w:tcPr>
+          <w:p>
+            <w:r>
+              <w:t>0.474359</w:t>
+            </w:r>
+          </w:p>
+        </w:tc>
+        <w:tc>
+          <w:tcPr>
+            <w:tcW w:type="dxa" w:w="1872"/>
+          </w:tcPr>
+          <w:p>
+            <w:r>
+              <w:t>0.532051</w:t>
+            </w:r>
+          </w:p>
+        </w:tc>
+        <w:tc>
+          <w:tcPr>
+            <w:tcW w:type="dxa" w:w="1872"/>
+          </w:tcPr>
+          <w:p>
+            <w:r>
+              <w:t>-0.057692</w:t>
+            </w:r>
+          </w:p>
+        </w:tc>
+      </w:tr>
+      <w:tr>
+        <w:tc>
+          <w:tcPr>
+            <w:tcW w:type="dxa" w:w="1872"/>
+          </w:tcPr>
+          <w:p>
+            <w:r>
+              <w:t>Model C (Trimmed + Extracted)</w:t>
+            </w:r>
+          </w:p>
+        </w:tc>
+        <w:tc>
+          <w:tcPr>
+            <w:tcW w:type="dxa" w:w="1872"/>
+          </w:tcPr>
+          <w:p>
+            <w:r>
+              <w:t>0.766026</w:t>
+            </w:r>
+          </w:p>
+        </w:tc>
+        <w:tc>
+          <w:tcPr>
+            <w:tcW w:type="dxa" w:w="1872"/>
+          </w:tcPr>
+          <w:p>
+            <w:r>
+              <w:t>0.474359</w:t>
+            </w:r>
+          </w:p>
+        </w:tc>
+        <w:tc>
+          <w:tcPr>
+            <w:tcW w:type="dxa" w:w="1872"/>
+          </w:tcPr>
+          <w:p>
+            <w:r>
+              <w:t>0.532051</w:t>
+            </w:r>
+          </w:p>
+        </w:tc>
+        <w:tc>
+          <w:tcPr>
+            <w:tcW w:type="dxa" w:w="1872"/>
+          </w:tcPr>
+          <w:p>
+            <w:r>
+              <w:t>-0.057692</w:t>
+            </w:r>
+          </w:p>
+        </w:tc>
+      </w:tr>
+    </w:tbl>
+    <w:tbl>
+      <w:tblPr>
+        <w:tblW w:type="auto" w:w="0"/>
+        <w:tblLook w:firstColumn="1" w:firstRow="1" w:lastColumn="0" w:lastRow="0" w:noHBand="0" w:noVBand="1" w:val="04A0"/>
+      </w:tblPr>
+      <w:tblGrid>
+        <w:gridCol w:w="3120"/>
+        <w:gridCol w:w="3120"/>
+        <w:gridCol w:w="3120"/>
+      </w:tblGrid>
+      <w:tr>
+        <w:tc>
+          <w:tcPr>
+            <w:tcW w:type="dxa" w:w="3120"/>
+          </w:tcPr>
+          <w:p>
+            <w:r>
+              <w:t>Criterion</w:t>
+            </w:r>
+          </w:p>
+        </w:tc>
+        <w:tc>
+          <w:tcPr>
+            <w:tcW w:type="dxa" w:w="3120"/>
+          </w:tcPr>
+          <w:p>
+            <w:r>
+              <w:t>Result</w:t>
+            </w:r>
+          </w:p>
+        </w:tc>
+        <w:tc>
+          <w:tcPr>
+            <w:tcW w:type="dxa" w:w="3120"/>
+          </w:tcPr>
+          <w:p>
+            <w:r>
+              <w:t>Status</w:t>
+            </w:r>
+          </w:p>
+        </w:tc>
+      </w:tr>
+      <w:tr>
+        <w:tc>
+          <w:tcPr>
+            <w:tcW w:type="dxa" w:w="3120"/>
+          </w:tcPr>
+          <w:p>
+            <w:r>
+              <w:t>Document generation success rate &gt;= 95%</w:t>
+            </w:r>
+          </w:p>
+        </w:tc>
+        <w:tc>
+          <w:tcPr>
+            <w:tcW w:type="dxa" w:w="3120"/>
+          </w:tcPr>
+          <w:p>
+            <w:r>
+              <w:t>715/716 (99.9%)</w:t>
+            </w:r>
+          </w:p>
+        </w:tc>
+        <w:tc>
+          <w:tcPr>
+            <w:tcW w:type="dxa" w:w="3120"/>
+          </w:tcPr>
+          <w:p>
+            <w:r>
+              <w:t>REVIEW</w:t>
+            </w:r>
+          </w:p>
+        </w:tc>
+      </w:tr>
+      <w:tr>
+        <w:tc>
+          <w:tcPr>
+            <w:tcW w:type="dxa" w:w="3120"/>
+          </w:tcPr>
+          <w:p>
+            <w:r>
+              <w:t>LLM extraction valid JSON parse rate &gt;= 90%</w:t>
+            </w:r>
+          </w:p>
+        </w:tc>
+        <w:tc>
+          <w:tcPr>
+            <w:tcW w:type="dxa" w:w="3120"/>
+          </w:tcPr>
+          <w:p>
+            <w:r>
+              <w:t>656/660 (99.4%)</w:t>
+            </w:r>
+          </w:p>
+        </w:tc>
+        <w:tc>
+          <w:tcPr>
+            <w:tcW w:type="dxa" w:w="3120"/>
+          </w:tcPr>
+          <w:p>
+            <w:r>
+              <w:t>REVIEW</w:t>
+            </w:r>
+          </w:p>
+        </w:tc>
+      </w:tr>
+      <w:tr>
+        <w:tc>
+          <w:tcPr>
+            <w:tcW w:type="dxa" w:w="3120"/>
+          </w:tcPr>
+          <w:p>
+            <w:r>
+              <w:t>Extraction accuracy — categorical &gt;= 85%</w:t>
+            </w:r>
+          </w:p>
+        </w:tc>
+        <w:tc>
+          <w:tcPr>
+            <w:tcW w:type="dxa" w:w="3120"/>
+          </w:tcPr>
+          <w:p>
+            <w:r>
+              <w:t>364/398 (91.5%)</w:t>
+            </w:r>
+          </w:p>
+        </w:tc>
+        <w:tc>
+          <w:tcPr>
+            <w:tcW w:type="dxa" w:w="3120"/>
+          </w:tcPr>
+          <w:p>
+            <w:r>
+              <w:t>REVIEW</w:t>
+            </w:r>
+          </w:p>
+        </w:tc>
+      </w:tr>
+      <w:tr>
+        <w:tc>
+          <w:tcPr>
+            <w:tcW w:type="dxa" w:w="3120"/>
+          </w:tcPr>
+          <w:p>
+            <w:r>
+              <w:t>Extraction accuracy — numeric &gt;= 80% (±10%)</w:t>
+            </w:r>
+          </w:p>
+        </w:tc>
+        <w:tc>
+          <w:tcPr>
+            <w:tcW w:type="dxa" w:w="3120"/>
+          </w:tcPr>
+          <w:p>
+            <w:r>
+              <w:t>286/305 (93.8%)</w:t>
+            </w:r>
+          </w:p>
+        </w:tc>
+        <w:tc>
+          <w:tcPr>
+            <w:tcW w:type="dxa" w:w="3120"/>
+          </w:tcPr>
+          <w:p>
+            <w:r>
+              <w:t>REVIEW</w:t>
+            </w:r>
+          </w:p>
+        </w:tc>
+      </w:tr>
+      <w:tr>
+        <w:tc>
+          <w:tcPr>
+            <w:tcW w:type="dxa" w:w="3120"/>
+          </w:tcPr>
+          <w:p>
+            <w:r>
+              <w:t>ROC-AUC delta (A vs C) &lt; 0.02</w:t>
+            </w:r>
+          </w:p>
+        </w:tc>
+        <w:tc>
+          <w:tcPr>
+            <w:tcW w:type="dxa" w:w="3120"/>
+          </w:tcPr>
+          <w:p>
+            <w:r>
+              <w:t>0.057692 (FAIL)</w:t>
+            </w:r>
+          </w:p>
+        </w:tc>
+        <w:tc>
+          <w:tcPr>
+            <w:tcW w:type="dxa" w:w="3120"/>
+          </w:tcPr>
+          <w:p>
+            <w:r>
+              <w:t>REVIEW</w:t>
+            </w:r>
+          </w:p>
+        </w:tc>
+      </w:tr>
+      <w:tr>
+        <w:tc>
+          <w:tcPr>
+            <w:tcW w:type="dxa" w:w="3120"/>
+          </w:tcPr>
+          <w:p>
+            <w:r>
+              <w:t>Model B ROC-AUC &gt; 0.70</w:t>
+            </w:r>
+          </w:p>
+        </w:tc>
+        <w:tc>
+          <w:tcPr>
+            <w:tcW w:type="dxa" w:w="3120"/>
+          </w:tcPr>
+          <w:p>
+            <w:r>
+              <w:t>0.766026 (PASS)</w:t>
+            </w:r>
+          </w:p>
+        </w:tc>
+        <w:tc>
+          <w:tcPr>
+            <w:tcW w:type="dxa" w:w="3120"/>
+          </w:tcPr>
+          <w:p>
+            <w:r>
+              <w:t>PASS</w:t>
+            </w:r>
+          </w:p>
+        </w:tc>
+      </w:tr>
+    </w:tbl>
+    <w:tbl>
+      <w:tblPr>
+        <w:tblW w:type="auto" w:w="0"/>
+        <w:tblLook w:firstColumn="1" w:firstRow="1" w:lastColumn="0" w:lastRow="0" w:noHBand="0" w:noVBand="1" w:val="04A0"/>
+      </w:tblPr>
+      <w:tblGrid>
+        <w:gridCol w:w="1872"/>
+        <w:gridCol w:w="1872"/>
+        <w:gridCol w:w="1872"/>
+        <w:gridCol w:w="1872"/>
+        <w:gridCol w:w="1872"/>
+      </w:tblGrid>
+      <w:tr>
+        <w:tc>
+          <w:tcPr>
+            <w:tcW w:type="dxa" w:w="1872"/>
+          </w:tcPr>
+          <w:p>
+            <w:r>
+              <w:t>Model</w:t>
+            </w:r>
+          </w:p>
+        </w:tc>
+        <w:tc>
+          <w:tcPr>
+            <w:tcW w:type="dxa" w:w="1872"/>
+          </w:tcPr>
+          <w:p>
+            <w:r>
+              <w:t>ROC-AUC</w:t>
+            </w:r>
+          </w:p>
+        </w:tc>
+        <w:tc>
+          <w:tcPr>
+            <w:tcW w:type="dxa" w:w="1872"/>
+          </w:tcPr>
+          <w:p>
+            <w:r>
+              <w:t>KS Statistic</w:t>
+            </w:r>
+          </w:p>
+        </w:tc>
+        <w:tc>
+          <w:tcPr>
+            <w:tcW w:type="dxa" w:w="1872"/>
+          </w:tcPr>
+          <w:p>
+            <w:r>
+              <w:t>Gini</w:t>
+            </w:r>
+          </w:p>
+        </w:tc>
+        <w:tc>
+          <w:tcPr>
+            <w:tcW w:type="dxa" w:w="1872"/>
+          </w:tcPr>
+          <w:p>
+            <w:r>
+              <w:t>AUC Delta vs A</w:t>
+            </w:r>
+          </w:p>
+        </w:tc>
+      </w:tr>
+      <w:tr>
+        <w:tc>
+          <w:tcPr>
+            <w:tcW w:type="dxa" w:w="1872"/>
+          </w:tcPr>
+          <w:p>
+            <w:r>
+              <w:t>Model A (Full Structured)</w:t>
+            </w:r>
+          </w:p>
+        </w:tc>
+        <w:tc>
+          <w:tcPr>
+            <w:tcW w:type="dxa" w:w="1872"/>
+          </w:tcPr>
+          <w:p>
+            <w:r>
+              <w:t>0.823718</w:t>
+            </w:r>
+          </w:p>
+        </w:tc>
+        <w:tc>
+          <w:tcPr>
+            <w:tcW w:type="dxa" w:w="1872"/>
+          </w:tcPr>
+          <w:p>
+            <w:r>
+              <w:t>0.538462</w:t>
+            </w:r>
+          </w:p>
+        </w:tc>
+        <w:tc>
+          <w:tcPr>
+            <w:tcW w:type="dxa" w:w="1872"/>
+          </w:tcPr>
+          <w:p>
+            <w:r>
+              <w:t>0.647436</w:t>
+            </w:r>
+          </w:p>
+        </w:tc>
+        <w:tc>
+          <w:tcPr>
+            <w:tcW w:type="dxa" w:w="1872"/>
+          </w:tcPr>
+          <w:p>
+            <w:r>
+              <w:t>+0.000000</w:t>
+            </w:r>
+          </w:p>
+        </w:tc>
+      </w:tr>
+      <w:tr>
+        <w:tc>
+          <w:tcPr>
+            <w:tcW w:type="dxa" w:w="1872"/>
+          </w:tcPr>
+          <w:p>
+            <w:r>
+              <w:t>Model B (Trimmed Only)</w:t>
+            </w:r>
+          </w:p>
+        </w:tc>
+        <w:tc>
+          <w:tcPr>
+            <w:tcW w:type="dxa" w:w="1872"/>
+          </w:tcPr>
+          <w:p>
+            <w:r>
+              <w:t>0.766026</w:t>
+            </w:r>
+          </w:p>
+        </w:tc>
+        <w:tc>
+          <w:tcPr>
+            <w:tcW w:type="dxa" w:w="1872"/>
+          </w:tcPr>
+          <w:p>
+            <w:r>
+              <w:t>0.474359</w:t>
+            </w:r>
+          </w:p>
+        </w:tc>
+        <w:tc>
+          <w:tcPr>
+            <w:tcW w:type="dxa" w:w="1872"/>
+          </w:tcPr>
+          <w:p>
+            <w:r>
+              <w:t>0.532051</w:t>
+            </w:r>
+          </w:p>
+        </w:tc>
+        <w:tc>
+          <w:tcPr>
+            <w:tcW w:type="dxa" w:w="1872"/>
+          </w:tcPr>
+          <w:p>
+            <w:r>
+              <w:t>-0.057692</w:t>
+            </w:r>
+          </w:p>
+        </w:tc>
+      </w:tr>
+      <w:tr>
+        <w:tc>
+          <w:tcPr>
+            <w:tcW w:type="dxa" w:w="1872"/>
+          </w:tcPr>
+          <w:p>
+            <w:r>
+              <w:t>Model C (Trimmed + Extracted)</w:t>
+            </w:r>
+          </w:p>
+        </w:tc>
+        <w:tc>
+          <w:tcPr>
+            <w:tcW w:type="dxa" w:w="1872"/>
+          </w:tcPr>
+          <w:p>
+            <w:r>
+              <w:t>0.685897</w:t>
+            </w:r>
+          </w:p>
+        </w:tc>
+        <w:tc>
+          <w:tcPr>
+            <w:tcW w:type="dxa" w:w="1872"/>
+          </w:tcPr>
+          <w:p>
+            <w:r>
+              <w:t>0.400641</w:t>
+            </w:r>
+          </w:p>
+        </w:tc>
+        <w:tc>
+          <w:tcPr>
+            <w:tcW w:type="dxa" w:w="1872"/>
+          </w:tcPr>
+          <w:p>
+            <w:r>
+              <w:t>0.371795</w:t>
+            </w:r>
+          </w:p>
+        </w:tc>
+        <w:tc>
+          <w:tcPr>
+            <w:tcW w:type="dxa" w:w="1872"/>
+          </w:tcPr>
+          <w:p>
+            <w:r>
+              <w:t>-0.137821</w:t>
+            </w:r>
+          </w:p>
+        </w:tc>
+      </w:tr>
+    </w:tbl>
+    <w:tbl>
+      <w:tblPr>
+        <w:tblW w:type="auto" w:w="0"/>
+        <w:tblLook w:firstColumn="1" w:firstRow="1" w:lastColumn="0" w:lastRow="0" w:noHBand="0" w:noVBand="1" w:val="04A0"/>
+      </w:tblPr>
+      <w:tblGrid>
+        <w:gridCol w:w="3120"/>
+        <w:gridCol w:w="3120"/>
+        <w:gridCol w:w="3120"/>
+      </w:tblGrid>
+      <w:tr>
+        <w:tc>
+          <w:tcPr>
+            <w:tcW w:type="dxa" w:w="3120"/>
+          </w:tcPr>
+          <w:p>
+            <w:r>
+              <w:t>Criterion</w:t>
+            </w:r>
+          </w:p>
+        </w:tc>
+        <w:tc>
+          <w:tcPr>
+            <w:tcW w:type="dxa" w:w="3120"/>
+          </w:tcPr>
+          <w:p>
+            <w:r>
+              <w:t>Result</w:t>
+            </w:r>
+          </w:p>
+        </w:tc>
+        <w:tc>
+          <w:tcPr>
+            <w:tcW w:type="dxa" w:w="3120"/>
+          </w:tcPr>
+          <w:p>
+            <w:r>
+              <w:t>Status</w:t>
+            </w:r>
+          </w:p>
+        </w:tc>
+      </w:tr>
+      <w:tr>
+        <w:tc>
+          <w:tcPr>
+            <w:tcW w:type="dxa" w:w="3120"/>
+          </w:tcPr>
+          <w:p>
+            <w:r>
+              <w:t>Document generation success rate &gt;= 95%</w:t>
+            </w:r>
+          </w:p>
+        </w:tc>
+        <w:tc>
+          <w:tcPr>
+            <w:tcW w:type="dxa" w:w="3120"/>
+          </w:tcPr>
+          <w:p>
+            <w:r>
+              <w:t>715/716 (99.9%)</w:t>
+            </w:r>
+          </w:p>
+        </w:tc>
+        <w:tc>
+          <w:tcPr>
+            <w:tcW w:type="dxa" w:w="3120"/>
+          </w:tcPr>
+          <w:p>
+            <w:r>
+              <w:t>REVIEW</w:t>
+            </w:r>
+          </w:p>
+        </w:tc>
+      </w:tr>
+      <w:tr>
+        <w:tc>
+          <w:tcPr>
+            <w:tcW w:type="dxa" w:w="3120"/>
+          </w:tcPr>
+          <w:p>
+            <w:r>
+              <w:t>LLM extraction valid JSON parse rate &gt;= 90%</w:t>
+            </w:r>
+          </w:p>
+        </w:tc>
+        <w:tc>
+          <w:tcPr>
+            <w:tcW w:type="dxa" w:w="3120"/>
+          </w:tcPr>
+          <w:p>
+            <w:r>
+              <w:t>656/660 (99.4%)</w:t>
+            </w:r>
+          </w:p>
+        </w:tc>
+        <w:tc>
+          <w:tcPr>
+            <w:tcW w:type="dxa" w:w="3120"/>
+          </w:tcPr>
+          <w:p>
+            <w:r>
+              <w:t>REVIEW</w:t>
+            </w:r>
+          </w:p>
+        </w:tc>
+      </w:tr>
+      <w:tr>
+        <w:tc>
+          <w:tcPr>
+            <w:tcW w:type="dxa" w:w="3120"/>
+          </w:tcPr>
+          <w:p>
+            <w:r>
+              <w:t>Extraction accuracy — categorical &gt;= 85%</w:t>
+            </w:r>
+          </w:p>
+        </w:tc>
+        <w:tc>
+          <w:tcPr>
+            <w:tcW w:type="dxa" w:w="3120"/>
+          </w:tcPr>
+          <w:p>
+            <w:r>
+              <w:t>364/398 (91.5%)</w:t>
+            </w:r>
+          </w:p>
+        </w:tc>
+        <w:tc>
+          <w:tcPr>
+            <w:tcW w:type="dxa" w:w="3120"/>
+          </w:tcPr>
+          <w:p>
+            <w:r>
+              <w:t>REVIEW</w:t>
+            </w:r>
+          </w:p>
+        </w:tc>
+      </w:tr>
+      <w:tr>
+        <w:tc>
+          <w:tcPr>
+            <w:tcW w:type="dxa" w:w="3120"/>
+          </w:tcPr>
+          <w:p>
+            <w:r>
+              <w:t>Extraction accuracy — numeric &gt;= 80% (±10%)</w:t>
+            </w:r>
+          </w:p>
+        </w:tc>
+        <w:tc>
+          <w:tcPr>
+            <w:tcW w:type="dxa" w:w="3120"/>
+          </w:tcPr>
+          <w:p>
+            <w:r>
+              <w:t>286/305 (93.8%)</w:t>
+            </w:r>
+          </w:p>
+        </w:tc>
+        <w:tc>
+          <w:tcPr>
+            <w:tcW w:type="dxa" w:w="3120"/>
+          </w:tcPr>
+          <w:p>
+            <w:r>
+              <w:t>REVIEW</w:t>
+            </w:r>
+          </w:p>
+        </w:tc>
+      </w:tr>
+      <w:tr>
+        <w:tc>
+          <w:tcPr>
+            <w:tcW w:type="dxa" w:w="3120"/>
+          </w:tcPr>
+          <w:p>
+            <w:r>
+              <w:t>ROC-AUC delta (A vs C) &lt; 0.02</w:t>
+            </w:r>
+          </w:p>
+        </w:tc>
+        <w:tc>
+          <w:tcPr>
+            <w:tcW w:type="dxa" w:w="3120"/>
+          </w:tcPr>
+          <w:p>
+            <w:r>
+              <w:t>0.137821 (FAIL)</w:t>
+            </w:r>
+          </w:p>
+        </w:tc>
+        <w:tc>
+          <w:tcPr>
+            <w:tcW w:type="dxa" w:w="3120"/>
+          </w:tcPr>
+          <w:p>
+            <w:r>
+              <w:t>REVIEW</w:t>
+            </w:r>
+          </w:p>
+        </w:tc>
+      </w:tr>
+      <w:tr>
+        <w:tc>
+          <w:tcPr>
+            <w:tcW w:type="dxa" w:w="3120"/>
+          </w:tcPr>
+          <w:p>
+            <w:r>
+              <w:t>Model B ROC-AUC &gt; 0.70</w:t>
+            </w:r>
+          </w:p>
+        </w:tc>
+        <w:tc>
+          <w:tcPr>
+            <w:tcW w:type="dxa" w:w="3120"/>
+          </w:tcPr>
+          <w:p>
+            <w:r>
+              <w:t>0.766026 (PASS)</w:t>
+            </w:r>
+          </w:p>
+        </w:tc>
+        <w:tc>
+          <w:tcPr>
+            <w:tcW w:type="dxa" w:w="3120"/>
+          </w:tcPr>
+          <w:p>
+            <w:r>
+              <w:t>PASS</w:t>
+            </w:r>
+          </w:p>
+        </w:tc>
+      </w:tr>
+    </w:tbl>
+    <w:tbl>
+      <w:tblPr>
+        <w:tblW w:type="auto" w:w="0"/>
+        <w:tblLook w:firstColumn="1" w:firstRow="1" w:lastColumn="0" w:lastRow="0" w:noHBand="0" w:noVBand="1" w:val="04A0"/>
+      </w:tblPr>
+      <w:tblGrid>
+        <w:gridCol w:w="1872"/>
+        <w:gridCol w:w="1872"/>
+        <w:gridCol w:w="1872"/>
+        <w:gridCol w:w="1872"/>
+        <w:gridCol w:w="1872"/>
+      </w:tblGrid>
+      <w:tr>
+        <w:tc>
+          <w:tcPr>
+            <w:tcW w:type="dxa" w:w="1872"/>
+          </w:tcPr>
+          <w:p>
+            <w:r>
+              <w:t>Model</w:t>
+            </w:r>
+          </w:p>
+        </w:tc>
+        <w:tc>
+          <w:tcPr>
+            <w:tcW w:type="dxa" w:w="1872"/>
+          </w:tcPr>
+          <w:p>
+            <w:r>
+              <w:t>ROC-AUC</w:t>
+            </w:r>
+          </w:p>
+        </w:tc>
+        <w:tc>
+          <w:tcPr>
+            <w:tcW w:type="dxa" w:w="1872"/>
+          </w:tcPr>
+          <w:p>
+            <w:r>
+              <w:t>KS Statistic</w:t>
+            </w:r>
+          </w:p>
+        </w:tc>
+        <w:tc>
+          <w:tcPr>
+            <w:tcW w:type="dxa" w:w="1872"/>
+          </w:tcPr>
+          <w:p>
+            <w:r>
+              <w:t>Gini</w:t>
+            </w:r>
+          </w:p>
+        </w:tc>
+        <w:tc>
+          <w:tcPr>
+            <w:tcW w:type="dxa" w:w="1872"/>
+          </w:tcPr>
+          <w:p>
+            <w:r>
+              <w:t>AUC Delta vs A</w:t>
+            </w:r>
+          </w:p>
+        </w:tc>
+      </w:tr>
+      <w:tr>
+        <w:tc>
+          <w:tcPr>
+            <w:tcW w:type="dxa" w:w="1872"/>
+          </w:tcPr>
+          <w:p>
+            <w:r>
+              <w:t>Model A (Full Structured)</w:t>
+            </w:r>
+          </w:p>
+        </w:tc>
+        <w:tc>
+          <w:tcPr>
+            <w:tcW w:type="dxa" w:w="1872"/>
+          </w:tcPr>
+          <w:p>
+            <w:r>
+              <w:t>0.823718</w:t>
+            </w:r>
+          </w:p>
+        </w:tc>
+        <w:tc>
+          <w:tcPr>
+            <w:tcW w:type="dxa" w:w="1872"/>
+          </w:tcPr>
+          <w:p>
+            <w:r>
+              <w:t>0.538462</w:t>
+            </w:r>
+          </w:p>
+        </w:tc>
+        <w:tc>
+          <w:tcPr>
+            <w:tcW w:type="dxa" w:w="1872"/>
+          </w:tcPr>
+          <w:p>
+            <w:r>
+              <w:t>0.647436</w:t>
+            </w:r>
+          </w:p>
+        </w:tc>
+        <w:tc>
+          <w:tcPr>
+            <w:tcW w:type="dxa" w:w="1872"/>
+          </w:tcPr>
+          <w:p>
+            <w:r>
+              <w:t>+0.000000</w:t>
+            </w:r>
+          </w:p>
+        </w:tc>
+      </w:tr>
+      <w:tr>
+        <w:tc>
+          <w:tcPr>
+            <w:tcW w:type="dxa" w:w="1872"/>
+          </w:tcPr>
+          <w:p>
+            <w:r>
+              <w:t>Model B (Trimmed Only)</w:t>
+            </w:r>
+          </w:p>
+        </w:tc>
+        <w:tc>
+          <w:tcPr>
+            <w:tcW w:type="dxa" w:w="1872"/>
+          </w:tcPr>
+          <w:p>
+            <w:r>
+              <w:t>0.766026</w:t>
+            </w:r>
+          </w:p>
+        </w:tc>
+        <w:tc>
+          <w:tcPr>
+            <w:tcW w:type="dxa" w:w="1872"/>
+          </w:tcPr>
+          <w:p>
+            <w:r>
+              <w:t>0.474359</w:t>
+            </w:r>
+          </w:p>
+        </w:tc>
+        <w:tc>
+          <w:tcPr>
+            <w:tcW w:type="dxa" w:w="1872"/>
+          </w:tcPr>
+          <w:p>
+            <w:r>
+              <w:t>0.532051</w:t>
+            </w:r>
+          </w:p>
+        </w:tc>
+        <w:tc>
+          <w:tcPr>
+            <w:tcW w:type="dxa" w:w="1872"/>
+          </w:tcPr>
+          <w:p>
+            <w:r>
+              <w:t>-0.057692</w:t>
+            </w:r>
+          </w:p>
+        </w:tc>
+      </w:tr>
+      <w:tr>
+        <w:tc>
+          <w:tcPr>
+            <w:tcW w:type="dxa" w:w="1872"/>
+          </w:tcPr>
+          <w:p>
+            <w:r>
+              <w:t>Model C (Trimmed + Extracted)</w:t>
+            </w:r>
+          </w:p>
+        </w:tc>
+        <w:tc>
+          <w:tcPr>
+            <w:tcW w:type="dxa" w:w="1872"/>
+          </w:tcPr>
+          <w:p>
+            <w:r>
+              <w:t>0.729167</w:t>
+            </w:r>
+          </w:p>
+        </w:tc>
+        <w:tc>
+          <w:tcPr>
+            <w:tcW w:type="dxa" w:w="1872"/>
+          </w:tcPr>
+          <w:p>
+            <w:r>
+              <w:t>0.541667</w:t>
+            </w:r>
+          </w:p>
+        </w:tc>
+        <w:tc>
+          <w:tcPr>
+            <w:tcW w:type="dxa" w:w="1872"/>
+          </w:tcPr>
+          <w:p>
+            <w:r>
+              <w:t>0.458333</w:t>
+            </w:r>
+          </w:p>
+        </w:tc>
+        <w:tc>
+          <w:tcPr>
+            <w:tcW w:type="dxa" w:w="1872"/>
+          </w:tcPr>
+          <w:p>
+            <w:r>
+              <w:t>-0.094551</w:t>
+            </w:r>
+          </w:p>
+        </w:tc>
+      </w:tr>
+    </w:tbl>
+    <w:tbl>
+      <w:tblPr>
+        <w:tblW w:type="auto" w:w="0"/>
+        <w:tblLook w:firstColumn="1" w:firstRow="1" w:lastColumn="0" w:lastRow="0" w:noHBand="0" w:noVBand="1" w:val="04A0"/>
+      </w:tblPr>
+      <w:tblGrid>
+        <w:gridCol w:w="3120"/>
+        <w:gridCol w:w="3120"/>
+        <w:gridCol w:w="3120"/>
+      </w:tblGrid>
+      <w:tr>
+        <w:tc>
+          <w:tcPr>
+            <w:tcW w:type="dxa" w:w="3120"/>
+          </w:tcPr>
+          <w:p>
+            <w:r>
+              <w:t>Criterion</w:t>
+            </w:r>
+          </w:p>
+        </w:tc>
+        <w:tc>
+          <w:tcPr>
+            <w:tcW w:type="dxa" w:w="3120"/>
+          </w:tcPr>
+          <w:p>
+            <w:r>
+              <w:t>Result</w:t>
+            </w:r>
+          </w:p>
+        </w:tc>
+        <w:tc>
+          <w:tcPr>
+            <w:tcW w:type="dxa" w:w="3120"/>
+          </w:tcPr>
+          <w:p>
+            <w:r>
+              <w:t>Status</w:t>
+            </w:r>
+          </w:p>
+        </w:tc>
+      </w:tr>
+      <w:tr>
+        <w:tc>
+          <w:tcPr>
+            <w:tcW w:type="dxa" w:w="3120"/>
+          </w:tcPr>
+          <w:p>
+            <w:r>
+              <w:t>Document generation success rate &gt;= 95%</w:t>
+            </w:r>
+          </w:p>
+        </w:tc>
+        <w:tc>
+          <w:tcPr>
+            <w:tcW w:type="dxa" w:w="3120"/>
+          </w:tcPr>
+          <w:p>
+            <w:r>
+              <w:t>715/716 (99.9%)</w:t>
+            </w:r>
+          </w:p>
+        </w:tc>
+        <w:tc>
+          <w:tcPr>
+            <w:tcW w:type="dxa" w:w="3120"/>
+          </w:tcPr>
+          <w:p>
+            <w:r>
+              <w:t>REVIEW</w:t>
+            </w:r>
+          </w:p>
+        </w:tc>
+      </w:tr>
+      <w:tr>
+        <w:tc>
+          <w:tcPr>
+            <w:tcW w:type="dxa" w:w="3120"/>
+          </w:tcPr>
+          <w:p>
+            <w:r>
+              <w:t>LLM extraction valid JSON parse rate &gt;= 90%</w:t>
+            </w:r>
+          </w:p>
+        </w:tc>
+        <w:tc>
+          <w:tcPr>
+            <w:tcW w:type="dxa" w:w="3120"/>
+          </w:tcPr>
+          <w:p>
+            <w:r>
+              <w:t>656/660 (99.4%)</w:t>
+            </w:r>
+          </w:p>
+        </w:tc>
+        <w:tc>
+          <w:tcPr>
+            <w:tcW w:type="dxa" w:w="3120"/>
+          </w:tcPr>
+          <w:p>
+            <w:r>
+              <w:t>REVIEW</w:t>
+            </w:r>
+          </w:p>
+        </w:tc>
+      </w:tr>
+      <w:tr>
+        <w:tc>
+          <w:tcPr>
+            <w:tcW w:type="dxa" w:w="3120"/>
+          </w:tcPr>
+          <w:p>
+            <w:r>
+              <w:t>Extraction accuracy — categorical &gt;= 85%</w:t>
+            </w:r>
+          </w:p>
+        </w:tc>
+        <w:tc>
+          <w:tcPr>
+            <w:tcW w:type="dxa" w:w="3120"/>
+          </w:tcPr>
+          <w:p>
+            <w:r>
+              <w:t>364/398 (91.5%)</w:t>
+            </w:r>
+          </w:p>
+        </w:tc>
+        <w:tc>
+          <w:tcPr>
+            <w:tcW w:type="dxa" w:w="3120"/>
+          </w:tcPr>
+          <w:p>
+            <w:r>
+              <w:t>REVIEW</w:t>
+            </w:r>
+          </w:p>
+        </w:tc>
+      </w:tr>
+      <w:tr>
+        <w:tc>
+          <w:tcPr>
+            <w:tcW w:type="dxa" w:w="3120"/>
+          </w:tcPr>
+          <w:p>
+            <w:r>
+              <w:t>Extraction accuracy — numeric &gt;= 80% (±10%)</w:t>
+            </w:r>
+          </w:p>
+        </w:tc>
+        <w:tc>
+          <w:tcPr>
+            <w:tcW w:type="dxa" w:w="3120"/>
+          </w:tcPr>
+          <w:p>
+            <w:r>
+              <w:t>286/305 (93.8%)</w:t>
+            </w:r>
+          </w:p>
+        </w:tc>
+        <w:tc>
+          <w:tcPr>
+            <w:tcW w:type="dxa" w:w="3120"/>
+          </w:tcPr>
+          <w:p>
+            <w:r>
+              <w:t>REVIEW</w:t>
+            </w:r>
+          </w:p>
+        </w:tc>
+      </w:tr>
+      <w:tr>
+        <w:tc>
+          <w:tcPr>
+            <w:tcW w:type="dxa" w:w="3120"/>
+          </w:tcPr>
+          <w:p>
+            <w:r>
+              <w:t>ROC-AUC delta (A vs C) &lt; 0.02</w:t>
+            </w:r>
+          </w:p>
+        </w:tc>
+        <w:tc>
+          <w:tcPr>
+            <w:tcW w:type="dxa" w:w="3120"/>
+          </w:tcPr>
+          <w:p>
+            <w:r>
+              <w:t>0.094551 (FAIL)</w:t>
+            </w:r>
+          </w:p>
+        </w:tc>
+        <w:tc>
+          <w:tcPr>
+            <w:tcW w:type="dxa" w:w="3120"/>
+          </w:tcPr>
+          <w:p>
+            <w:r>
+              <w:t>REVIEW</w:t>
+            </w:r>
+          </w:p>
+        </w:tc>
+      </w:tr>
+      <w:tr>
+        <w:tc>
+          <w:tcPr>
+            <w:tcW w:type="dxa" w:w="3120"/>
+          </w:tcPr>
+          <w:p>
+            <w:r>
+              <w:t>Model B ROC-AUC &gt; 0.70</w:t>
+            </w:r>
+          </w:p>
+        </w:tc>
+        <w:tc>
+          <w:tcPr>
+            <w:tcW w:type="dxa" w:w="3120"/>
+          </w:tcPr>
+          <w:p>
+            <w:r>
+              <w:t>0.766026 (PASS)</w:t>
+            </w:r>
+          </w:p>
+        </w:tc>
+        <w:tc>
+          <w:tcPr>
+            <w:tcW w:type="dxa" w:w="3120"/>
+          </w:tcPr>
+          <w:p>
+            <w:r>
+              <w:t>PASS</w:t>
+            </w:r>
+          </w:p>
+        </w:tc>
+      </w:tr>
+    </w:tbl>
+    <w:p>
+      <w:pPr>
+        <w:pStyle w:val="Heading1"/>
+      </w:pPr>
+      <w:r>
+        <w:t>PoC Results</w:t>
+      </w:r>
+    </w:p>
+    <w:p>
+      <w:r>
+        <w:t>Generated on 2026-03-06 10:50 | Sample size: 110 customers | 6 document types per customer</w:t>
+      </w:r>
+    </w:p>
+    <w:p>
+      <w:pPr>
+        <w:pStyle w:val="Heading2"/>
+      </w:pPr>
+      <w:r>
+        <w:t>Model Comparison</w:t>
+      </w:r>
+    </w:p>
+    <w:tbl>
+      <w:tblPr>
+        <w:tblW w:type="auto" w:w="0"/>
+        <w:tblLook w:firstColumn="1" w:firstRow="1" w:lastColumn="0" w:lastRow="0" w:noHBand="0" w:noVBand="1" w:val="04A0"/>
+      </w:tblPr>
+      <w:tblGrid>
+        <w:gridCol w:w="1872"/>
+        <w:gridCol w:w="1872"/>
+        <w:gridCol w:w="1872"/>
+        <w:gridCol w:w="1872"/>
+        <w:gridCol w:w="1872"/>
+      </w:tblGrid>
+      <w:tr>
+        <w:tc>
+          <w:tcPr>
+            <w:tcW w:type="dxa" w:w="1872"/>
+          </w:tcPr>
+          <w:p>
+            <w:r>
+              <w:t>Model</w:t>
+            </w:r>
+          </w:p>
+        </w:tc>
+        <w:tc>
+          <w:tcPr>
+            <w:tcW w:type="dxa" w:w="1872"/>
+          </w:tcPr>
+          <w:p>
+            <w:r>
+              <w:t>ROC-AUC</w:t>
+            </w:r>
+          </w:p>
+        </w:tc>
+        <w:tc>
+          <w:tcPr>
+            <w:tcW w:type="dxa" w:w="1872"/>
+          </w:tcPr>
+          <w:p>
+            <w:r>
+              <w:t>KS Statistic</w:t>
+            </w:r>
+          </w:p>
+        </w:tc>
+        <w:tc>
+          <w:tcPr>
+            <w:tcW w:type="dxa" w:w="1872"/>
+          </w:tcPr>
+          <w:p>
+            <w:r>
+              <w:t>Gini</w:t>
+            </w:r>
+          </w:p>
+        </w:tc>
+        <w:tc>
+          <w:tcPr>
+            <w:tcW w:type="dxa" w:w="1872"/>
+          </w:tcPr>
+          <w:p>
+            <w:r>
+              <w:t>AUC Delta vs A</w:t>
+            </w:r>
+          </w:p>
+        </w:tc>
+      </w:tr>
+      <w:tr>
+        <w:tc>
+          <w:tcPr>
+            <w:tcW w:type="dxa" w:w="1872"/>
+          </w:tcPr>
+          <w:p>
+            <w:r>
+              <w:t>Model A (Full Structured)</w:t>
+            </w:r>
+          </w:p>
+        </w:tc>
+        <w:tc>
+          <w:tcPr>
+            <w:tcW w:type="dxa" w:w="1872"/>
+          </w:tcPr>
+          <w:p>
+            <w:r>
+              <w:t>0.823718</w:t>
+            </w:r>
+          </w:p>
+        </w:tc>
+        <w:tc>
+          <w:tcPr>
+            <w:tcW w:type="dxa" w:w="1872"/>
+          </w:tcPr>
+          <w:p>
+            <w:r>
+              <w:t>0.538462</w:t>
+            </w:r>
+          </w:p>
+        </w:tc>
+        <w:tc>
+          <w:tcPr>
+            <w:tcW w:type="dxa" w:w="1872"/>
+          </w:tcPr>
+          <w:p>
+            <w:r>
+              <w:t>0.647436</w:t>
+            </w:r>
+          </w:p>
+        </w:tc>
+        <w:tc>
+          <w:tcPr>
+            <w:tcW w:type="dxa" w:w="1872"/>
+          </w:tcPr>
+          <w:p>
+            <w:r>
+              <w:t>+0.000000</w:t>
+            </w:r>
+          </w:p>
+        </w:tc>
+      </w:tr>
+      <w:tr>
+        <w:tc>
+          <w:tcPr>
+            <w:tcW w:type="dxa" w:w="1872"/>
+          </w:tcPr>
+          <w:p>
+            <w:r>
+              <w:t>Model B (Trimmed Only)</w:t>
+            </w:r>
+          </w:p>
+        </w:tc>
+        <w:tc>
+          <w:tcPr>
+            <w:tcW w:type="dxa" w:w="1872"/>
+          </w:tcPr>
+          <w:p>
+            <w:r>
+              <w:t>0.766026</w:t>
+            </w:r>
+          </w:p>
+        </w:tc>
+        <w:tc>
+          <w:tcPr>
+            <w:tcW w:type="dxa" w:w="1872"/>
+          </w:tcPr>
+          <w:p>
+            <w:r>
+              <w:t>0.474359</w:t>
+            </w:r>
+          </w:p>
+        </w:tc>
+        <w:tc>
+          <w:tcPr>
+            <w:tcW w:type="dxa" w:w="1872"/>
+          </w:tcPr>
+          <w:p>
+            <w:r>
+              <w:t>0.532051</w:t>
+            </w:r>
+          </w:p>
+        </w:tc>
+        <w:tc>
+          <w:tcPr>
+            <w:tcW w:type="dxa" w:w="1872"/>
+          </w:tcPr>
+          <w:p>
+            <w:r>
+              <w:t>-0.057692</w:t>
+            </w:r>
+          </w:p>
+        </w:tc>
+      </w:tr>
+      <w:tr>
+        <w:tc>
+          <w:tcPr>
+            <w:tcW w:type="dxa" w:w="1872"/>
+          </w:tcPr>
+          <w:p>
+            <w:r>
+              <w:t>Model C (Trimmed + Extracted)</w:t>
+            </w:r>
+          </w:p>
+        </w:tc>
+        <w:tc>
+          <w:tcPr>
+            <w:tcW w:type="dxa" w:w="1872"/>
+          </w:tcPr>
+          <w:p>
+            <w:r>
+              <w:t>0.833333</w:t>
+            </w:r>
+          </w:p>
+        </w:tc>
+        <w:tc>
+          <w:tcPr>
+            <w:tcW w:type="dxa" w:w="1872"/>
+          </w:tcPr>
+          <w:p>
+            <w:r>
+              <w:t>0.573718</w:t>
+            </w:r>
+          </w:p>
+        </w:tc>
+        <w:tc>
+          <w:tcPr>
+            <w:tcW w:type="dxa" w:w="1872"/>
+          </w:tcPr>
+          <w:p>
+            <w:r>
+              <w:t>0.666667</w:t>
+            </w:r>
+          </w:p>
+        </w:tc>
+        <w:tc>
+          <w:tcPr>
+            <w:tcW w:type="dxa" w:w="1872"/>
+          </w:tcPr>
+          <w:p>
+            <w:r>
+              <w:t>+0.009615</w:t>
+            </w:r>
+          </w:p>
+        </w:tc>
+      </w:tr>
+    </w:tbl>
+    <w:p>
+      <w:r>
+        <w:t>Model A 5-fold CV AUC (from notebook 01): 0.765949</w:t>
+      </w:r>
+    </w:p>
+    <w:p>
+      <w:pPr>
+        <w:pStyle w:val="Heading2"/>
+      </w:pPr>
+      <w:r>
+        <w:t>Extraction Accuracy vs Ground Truth</w:t>
+      </w:r>
+    </w:p>
+    <w:p>
+      <w:r>
+        <w:t>Categorical accuracy: 364/398 (91.5%) — target &gt;= 85%</w:t>
+      </w:r>
+    </w:p>
+    <w:p>
+      <w:r>
+        <w:t>Numeric accuracy (±10%): 286/305 (93.8%) — target &gt;= 80%</w:t>
+      </w:r>
+    </w:p>
+    <w:p>
+      <w:pPr>
+        <w:pStyle w:val="Heading2"/>
+      </w:pPr>
+      <w:r>
+        <w:t>Document Generation</w:t>
+      </w:r>
+    </w:p>
+    <w:p>
+      <w:r>
+        <w:t>Success rate: 715/716 (99.9%) — target &gt;= 95%</w:t>
+      </w:r>
+    </w:p>
+    <w:p>
+      <w:r>
+        <w:t>LLM extraction parse rate: 656/660 (99.4%) — target &gt;= 90%</w:t>
+      </w:r>
+    </w:p>
+    <w:p>
+      <w:pPr>
+        <w:pStyle w:val="Heading2"/>
+      </w:pPr>
+      <w:r>
+        <w:t>Success Criteria Summary</w:t>
+      </w:r>
+    </w:p>
+    <w:tbl>
+      <w:tblPr>
+        <w:tblW w:type="auto" w:w="0"/>
+        <w:tblLook w:firstColumn="1" w:firstRow="1" w:lastColumn="0" w:lastRow="0" w:noHBand="0" w:noVBand="1" w:val="04A0"/>
+      </w:tblPr>
+      <w:tblGrid>
+        <w:gridCol w:w="3120"/>
+        <w:gridCol w:w="3120"/>
+        <w:gridCol w:w="3120"/>
+      </w:tblGrid>
+      <w:tr>
+        <w:tc>
+          <w:tcPr>
+            <w:tcW w:type="dxa" w:w="3120"/>
+          </w:tcPr>
+          <w:p>
+            <w:r>
+              <w:t>Criterion</w:t>
+            </w:r>
+          </w:p>
+        </w:tc>
+        <w:tc>
+          <w:tcPr>
+            <w:tcW w:type="dxa" w:w="3120"/>
+          </w:tcPr>
+          <w:p>
+            <w:r>
+              <w:t>Result</w:t>
+            </w:r>
+          </w:p>
+        </w:tc>
+        <w:tc>
+          <w:tcPr>
+            <w:tcW w:type="dxa" w:w="3120"/>
+          </w:tcPr>
+          <w:p>
+            <w:r>
+              <w:t>Status</w:t>
+            </w:r>
+          </w:p>
+        </w:tc>
+      </w:tr>
+      <w:tr>
+        <w:tc>
+          <w:tcPr>
+            <w:tcW w:type="dxa" w:w="3120"/>
+          </w:tcPr>
+          <w:p>
+            <w:r>
+              <w:t>Document generation success rate &gt;= 95%</w:t>
+            </w:r>
+          </w:p>
+        </w:tc>
+        <w:tc>
+          <w:tcPr>
+            <w:tcW w:type="dxa" w:w="3120"/>
+          </w:tcPr>
+          <w:p>
+            <w:r>
+              <w:t>715/716 (99.9%)</w:t>
+            </w:r>
+          </w:p>
+        </w:tc>
+        <w:tc>
+          <w:tcPr>
+            <w:tcW w:type="dxa" w:w="3120"/>
+          </w:tcPr>
+          <w:p>
+            <w:r>
+              <w:t>REVIEW</w:t>
+            </w:r>
+          </w:p>
+        </w:tc>
+      </w:tr>
+      <w:tr>
+        <w:tc>
+          <w:tcPr>
+            <w:tcW w:type="dxa" w:w="3120"/>
+          </w:tcPr>
+          <w:p>
+            <w:r>
+              <w:t>LLM extraction valid JSON parse rate &gt;= 90%</w:t>
+            </w:r>
+          </w:p>
+        </w:tc>
+        <w:tc>
+          <w:tcPr>
+            <w:tcW w:type="dxa" w:w="3120"/>
+          </w:tcPr>
+          <w:p>
+            <w:r>
+              <w:t>656/660 (99.4%)</w:t>
+            </w:r>
+          </w:p>
+        </w:tc>
+        <w:tc>
+          <w:tcPr>
+            <w:tcW w:type="dxa" w:w="3120"/>
+          </w:tcPr>
+          <w:p>
+            <w:r>
+              <w:t>REVIEW</w:t>
+            </w:r>
+          </w:p>
+        </w:tc>
+      </w:tr>
+      <w:tr>
+        <w:tc>
+          <w:tcPr>
+            <w:tcW w:type="dxa" w:w="3120"/>
+          </w:tcPr>
+          <w:p>
+            <w:r>
+              <w:t>Extraction accuracy — categorical &gt;= 85%</w:t>
+            </w:r>
+          </w:p>
+        </w:tc>
+        <w:tc>
+          <w:tcPr>
+            <w:tcW w:type="dxa" w:w="3120"/>
+          </w:tcPr>
+          <w:p>
+            <w:r>
+              <w:t>364/398 (91.5%)</w:t>
+            </w:r>
+          </w:p>
+        </w:tc>
+        <w:tc>
+          <w:tcPr>
+            <w:tcW w:type="dxa" w:w="3120"/>
+          </w:tcPr>
+          <w:p>
+            <w:r>
+              <w:t>REVIEW</w:t>
+            </w:r>
+          </w:p>
+        </w:tc>
+      </w:tr>
+      <w:tr>
+        <w:tc>
+          <w:tcPr>
+            <w:tcW w:type="dxa" w:w="3120"/>
+          </w:tcPr>
+          <w:p>
+            <w:r>
+              <w:t>Extraction accuracy — numeric &gt;= 80% (±10%)</w:t>
+            </w:r>
+          </w:p>
+        </w:tc>
+        <w:tc>
+          <w:tcPr>
+            <w:tcW w:type="dxa" w:w="3120"/>
+          </w:tcPr>
+          <w:p>
+            <w:r>
+              <w:t>286/305 (93.8%)</w:t>
+            </w:r>
+          </w:p>
+        </w:tc>
+        <w:tc>
+          <w:tcPr>
+            <w:tcW w:type="dxa" w:w="3120"/>
+          </w:tcPr>
+          <w:p>
+            <w:r>
+              <w:t>REVIEW</w:t>
+            </w:r>
+          </w:p>
+        </w:tc>
+      </w:tr>
+      <w:tr>
+        <w:tc>
+          <w:tcPr>
+            <w:tcW w:type="dxa" w:w="3120"/>
+          </w:tcPr>
+          <w:p>
+            <w:r>
+              <w:t>ROC-AUC delta (A vs C) &lt; 0.02</w:t>
+            </w:r>
+          </w:p>
+        </w:tc>
+        <w:tc>
+          <w:tcPr>
+            <w:tcW w:type="dxa" w:w="3120"/>
+          </w:tcPr>
+          <w:p>
+            <w:r>
+              <w:t>0.009615 (PASS)</w:t>
+            </w:r>
+          </w:p>
+        </w:tc>
+        <w:tc>
+          <w:tcPr>
+            <w:tcW w:type="dxa" w:w="3120"/>
+          </w:tcPr>
+          <w:p>
+            <w:r>
+              <w:t>PASS</w:t>
+            </w:r>
+          </w:p>
+        </w:tc>
+      </w:tr>
+      <w:tr>
+        <w:tc>
+          <w:tcPr>
+            <w:tcW w:type="dxa" w:w="3120"/>
+          </w:tcPr>
+          <w:p>
+            <w:r>
+              <w:t>Model B ROC-AUC &gt; 0.70</w:t>
+            </w:r>
+          </w:p>
+        </w:tc>
+        <w:tc>
+          <w:tcPr>
+            <w:tcW w:type="dxa" w:w="3120"/>
+          </w:tcPr>
+          <w:p>
+            <w:r>
+              <w:t>0.766026 (PASS)</w:t>
+            </w:r>
+          </w:p>
+        </w:tc>
+        <w:tc>
+          <w:tcPr>
+            <w:tcW w:type="dxa" w:w="3120"/>
+          </w:tcPr>
+          <w:p>
+            <w:r>
+              <w:t>PASS</w:t>
+            </w:r>
+          </w:p>
+        </w:tc>
+      </w:tr>
+    </w:tbl>
     <w:sectPr>
       <w:pgSz w:h="15840" w:w="12240" w:orient="portrait"/>
       <w:pgMar w:bottom="1440" w:top="1440" w:left="1440" w:right="1440" w:header="720" w:footer="720"/>

</xml_diff>